<commit_message>
add new readme, LICENSE, report, updated .gitignore, removed .exe files
</commit_message>
<xml_diff>
--- a/Отчет.docx
+++ b/Отчет.docx
@@ -1578,7 +1578,7 @@
       </w:r>
       <w:r>
         <w:rPr>
-          <w:rStyle w:val="5"/>
+          <w:rStyle w:val="4"/>
           <w:rFonts w:hint="default"/>
           <w:b/>
           <w:bCs/>
@@ -1683,15 +1683,12 @@
         <w:sectPr>
           <w:pgSz w:w="28346" w:h="20160" w:orient="landscape"/>
           <w:pgMar w:top="1699" w:right="1138" w:bottom="850" w:left="1138" w:header="708" w:footer="706" w:gutter="0"/>
-          <w:paperSrc/>
           <w:cols w:space="0" w:num="1"/>
           <w:titlePg/>
           <w:rtlGutter w:val="0"/>
           <w:docGrid w:linePitch="360" w:charSpace="0"/>
         </w:sectPr>
       </w:pPr>
-      <w:bookmarkStart w:id="0" w:name="_GoBack"/>
-      <w:bookmarkEnd w:id="0"/>
     </w:p>
     <w:p>
       <w:pPr>
@@ -1703,23 +1700,6 @@
           <w:lang w:val="ru-RU"/>
         </w:rPr>
       </w:pPr>
-    </w:p>
-    <w:p>
-      <w:pPr>
-        <w:spacing w:after="0"/>
-        <w:jc w:val="center"/>
-        <w:rPr>
-          <w:rFonts w:ascii="Times New Roman" w:hAnsi="Times New Roman" w:cs="Times New Roman"/>
-          <w:sz w:val="24"/>
-        </w:rPr>
-      </w:pPr>
-      <w:r>
-        <w:rPr>
-          <w:rFonts w:ascii="Times New Roman" w:hAnsi="Times New Roman" w:cs="Times New Roman"/>
-          <w:sz w:val="24"/>
-        </w:rPr>
-        <w:br w:type="page"/>
-      </w:r>
     </w:p>
     <w:p>
       <w:pPr>
@@ -1732,6 +1712,8 @@
           <w:highlight w:val="yellow"/>
         </w:rPr>
       </w:pPr>
+      <w:bookmarkStart w:id="0" w:name="_GoBack"/>
+      <w:bookmarkEnd w:id="0"/>
       <w:r>
         <w:rPr>
           <w:rFonts w:ascii="Times New Roman" w:hAnsi="Times New Roman" w:cs="Times New Roman"/>
@@ -5599,7 +5581,7 @@
     <w:sdtContent>
       <w:p>
         <w:pPr>
-          <w:pStyle w:val="6"/>
+          <w:pStyle w:val="10"/>
           <w:jc w:val="center"/>
         </w:pPr>
         <w:r>
@@ -5647,7 +5629,7 @@
 <w:ftr xmlns:wpc="http://schemas.microsoft.com/office/word/2010/wordprocessingCanvas" xmlns:mc="http://schemas.openxmlformats.org/markup-compatibility/2006" xmlns:o="urn:schemas-microsoft-com:office:office" xmlns:r="http://schemas.openxmlformats.org/officeDocument/2006/relationships" xmlns:m="http://schemas.openxmlformats.org/officeDocument/2006/math" xmlns:v="urn:schemas-microsoft-com:vml" xmlns:wp14="http://schemas.microsoft.com/office/word/2010/wordprocessingDrawing" xmlns:wp="http://schemas.openxmlformats.org/drawingml/2006/wordprocessingDrawing" xmlns:w10="urn:schemas-microsoft-com:office:word" xmlns:w="http://schemas.openxmlformats.org/wordprocessingml/2006/main" xmlns:w14="http://schemas.microsoft.com/office/word/2010/wordml" xmlns:w15="http://schemas.microsoft.com/office/word/2012/wordml" xmlns:wpg="http://schemas.microsoft.com/office/word/2010/wordprocessingGroup" xmlns:wpi="http://schemas.microsoft.com/office/word/2010/wordprocessingInk" xmlns:wne="http://schemas.microsoft.com/office/word/2006/wordml" xmlns:wps="http://schemas.microsoft.com/office/word/2010/wordprocessingShape" xmlns:wpsCustomData="http://www.wps.cn/officeDocument/2013/wpsCustomData" mc:Ignorable="w14 w15 wp14">
   <w:p>
     <w:pPr>
-      <w:pStyle w:val="6"/>
+      <w:pStyle w:val="10"/>
       <w:jc w:val="center"/>
       <w:rPr>
         <w:rFonts w:ascii="Times New Roman" w:hAnsi="Times New Roman" w:cs="Times New Roman"/>
@@ -5853,105 +5835,7 @@
     <w:lsdException w:qFormat="1" w:uiPriority="99" w:name="Balloon Text"/>
     <w:lsdException w:unhideWhenUsed="0" w:uiPriority="59" w:semiHidden="0" w:name="Table Grid"/>
     <w:lsdException w:uiPriority="99" w:name="Table Theme"/>
-    <w:lsdException w:qFormat="1" w:unhideWhenUsed="0" w:uiPriority="60" w:semiHidden="0" w:name="Light Shading"/>
-    <w:lsdException w:qFormat="1" w:unhideWhenUsed="0" w:uiPriority="61" w:semiHidden="0" w:name="Light List"/>
-    <w:lsdException w:qFormat="1" w:unhideWhenUsed="0" w:uiPriority="62" w:semiHidden="0" w:name="Light Grid"/>
-    <w:lsdException w:qFormat="1" w:unhideWhenUsed="0" w:uiPriority="63" w:semiHidden="0" w:name="Medium Shading 1"/>
-    <w:lsdException w:unhideWhenUsed="0" w:uiPriority="64" w:semiHidden="0" w:name="Medium Shading 2"/>
-    <w:lsdException w:unhideWhenUsed="0" w:uiPriority="65" w:semiHidden="0" w:name="Medium List 1"/>
-    <w:lsdException w:unhideWhenUsed="0" w:uiPriority="66" w:semiHidden="0" w:name="Medium List 2"/>
-    <w:lsdException w:unhideWhenUsed="0" w:uiPriority="67" w:semiHidden="0" w:name="Medium Grid 1"/>
-    <w:lsdException w:unhideWhenUsed="0" w:uiPriority="68" w:semiHidden="0" w:name="Medium Grid 2"/>
-    <w:lsdException w:unhideWhenUsed="0" w:uiPriority="69" w:semiHidden="0" w:name="Medium Grid 3"/>
-    <w:lsdException w:unhideWhenUsed="0" w:uiPriority="70" w:semiHidden="0" w:name="Dark List"/>
-    <w:lsdException w:unhideWhenUsed="0" w:uiPriority="71" w:semiHidden="0" w:name="Colorful Shading"/>
-    <w:lsdException w:unhideWhenUsed="0" w:uiPriority="72" w:semiHidden="0" w:name="Colorful List"/>
-    <w:lsdException w:unhideWhenUsed="0" w:uiPriority="73" w:semiHidden="0" w:name="Colorful Grid"/>
-    <w:lsdException w:qFormat="1" w:unhideWhenUsed="0" w:uiPriority="60" w:semiHidden="0" w:name="Light Shading Accent 1"/>
-    <w:lsdException w:qFormat="1" w:unhideWhenUsed="0" w:uiPriority="61" w:semiHidden="0" w:name="Light List Accent 1"/>
-    <w:lsdException w:qFormat="1" w:unhideWhenUsed="0" w:uiPriority="62" w:semiHidden="0" w:name="Light Grid Accent 1"/>
-    <w:lsdException w:qFormat="1" w:unhideWhenUsed="0" w:uiPriority="63" w:semiHidden="0" w:name="Medium Shading 1 Accent 1"/>
-    <w:lsdException w:unhideWhenUsed="0" w:uiPriority="64" w:semiHidden="0" w:name="Medium Shading 2 Accent 1"/>
-    <w:lsdException w:unhideWhenUsed="0" w:uiPriority="65" w:semiHidden="0" w:name="Medium List 1 Accent 1"/>
     <w:lsdException w:qFormat="1" w:unhideWhenUsed="0" w:uiPriority="34" w:semiHidden="0" w:name="List Paragraph"/>
-    <w:lsdException w:unhideWhenUsed="0" w:uiPriority="66" w:semiHidden="0" w:name="Medium List 2 Accent 1"/>
-    <w:lsdException w:unhideWhenUsed="0" w:uiPriority="67" w:semiHidden="0" w:name="Medium Grid 1 Accent 1"/>
-    <w:lsdException w:unhideWhenUsed="0" w:uiPriority="68" w:semiHidden="0" w:name="Medium Grid 2 Accent 1"/>
-    <w:lsdException w:unhideWhenUsed="0" w:uiPriority="69" w:semiHidden="0" w:name="Medium Grid 3 Accent 1"/>
-    <w:lsdException w:unhideWhenUsed="0" w:uiPriority="70" w:semiHidden="0" w:name="Dark List Accent 1"/>
-    <w:lsdException w:unhideWhenUsed="0" w:uiPriority="71" w:semiHidden="0" w:name="Colorful Shading Accent 1"/>
-    <w:lsdException w:unhideWhenUsed="0" w:uiPriority="72" w:semiHidden="0" w:name="Colorful List Accent 1"/>
-    <w:lsdException w:unhideWhenUsed="0" w:uiPriority="73" w:semiHidden="0" w:name="Colorful Grid Accent 1"/>
-    <w:lsdException w:qFormat="1" w:unhideWhenUsed="0" w:uiPriority="60" w:semiHidden="0" w:name="Light Shading Accent 2"/>
-    <w:lsdException w:qFormat="1" w:unhideWhenUsed="0" w:uiPriority="61" w:semiHidden="0" w:name="Light List Accent 2"/>
-    <w:lsdException w:qFormat="1" w:unhideWhenUsed="0" w:uiPriority="62" w:semiHidden="0" w:name="Light Grid Accent 2"/>
-    <w:lsdException w:unhideWhenUsed="0" w:uiPriority="63" w:semiHidden="0" w:name="Medium Shading 1 Accent 2"/>
-    <w:lsdException w:unhideWhenUsed="0" w:uiPriority="64" w:semiHidden="0" w:name="Medium Shading 2 Accent 2"/>
-    <w:lsdException w:unhideWhenUsed="0" w:uiPriority="65" w:semiHidden="0" w:name="Medium List 1 Accent 2"/>
-    <w:lsdException w:unhideWhenUsed="0" w:uiPriority="66" w:semiHidden="0" w:name="Medium List 2 Accent 2"/>
-    <w:lsdException w:unhideWhenUsed="0" w:uiPriority="67" w:semiHidden="0" w:name="Medium Grid 1 Accent 2"/>
-    <w:lsdException w:unhideWhenUsed="0" w:uiPriority="68" w:semiHidden="0" w:name="Medium Grid 2 Accent 2"/>
-    <w:lsdException w:unhideWhenUsed="0" w:uiPriority="69" w:semiHidden="0" w:name="Medium Grid 3 Accent 2"/>
-    <w:lsdException w:unhideWhenUsed="0" w:uiPriority="70" w:semiHidden="0" w:name="Dark List Accent 2"/>
-    <w:lsdException w:unhideWhenUsed="0" w:uiPriority="71" w:semiHidden="0" w:name="Colorful Shading Accent 2"/>
-    <w:lsdException w:unhideWhenUsed="0" w:uiPriority="72" w:semiHidden="0" w:name="Colorful List Accent 2"/>
-    <w:lsdException w:unhideWhenUsed="0" w:uiPriority="73" w:semiHidden="0" w:name="Colorful Grid Accent 2"/>
-    <w:lsdException w:qFormat="1" w:unhideWhenUsed="0" w:uiPriority="60" w:semiHidden="0" w:name="Light Shading Accent 3"/>
-    <w:lsdException w:qFormat="1" w:unhideWhenUsed="0" w:uiPriority="61" w:semiHidden="0" w:name="Light List Accent 3"/>
-    <w:lsdException w:qFormat="1" w:unhideWhenUsed="0" w:uiPriority="62" w:semiHidden="0" w:name="Light Grid Accent 3"/>
-    <w:lsdException w:unhideWhenUsed="0" w:uiPriority="63" w:semiHidden="0" w:name="Medium Shading 1 Accent 3"/>
-    <w:lsdException w:unhideWhenUsed="0" w:uiPriority="64" w:semiHidden="0" w:name="Medium Shading 2 Accent 3"/>
-    <w:lsdException w:unhideWhenUsed="0" w:uiPriority="65" w:semiHidden="0" w:name="Medium List 1 Accent 3"/>
-    <w:lsdException w:unhideWhenUsed="0" w:uiPriority="66" w:semiHidden="0" w:name="Medium List 2 Accent 3"/>
-    <w:lsdException w:unhideWhenUsed="0" w:uiPriority="67" w:semiHidden="0" w:name="Medium Grid 1 Accent 3"/>
-    <w:lsdException w:unhideWhenUsed="0" w:uiPriority="68" w:semiHidden="0" w:name="Medium Grid 2 Accent 3"/>
-    <w:lsdException w:unhideWhenUsed="0" w:uiPriority="69" w:semiHidden="0" w:name="Medium Grid 3 Accent 3"/>
-    <w:lsdException w:unhideWhenUsed="0" w:uiPriority="70" w:semiHidden="0" w:name="Dark List Accent 3"/>
-    <w:lsdException w:unhideWhenUsed="0" w:uiPriority="71" w:semiHidden="0" w:name="Colorful Shading Accent 3"/>
-    <w:lsdException w:unhideWhenUsed="0" w:uiPriority="72" w:semiHidden="0" w:name="Colorful List Accent 3"/>
-    <w:lsdException w:unhideWhenUsed="0" w:uiPriority="73" w:semiHidden="0" w:name="Colorful Grid Accent 3"/>
-    <w:lsdException w:qFormat="1" w:unhideWhenUsed="0" w:uiPriority="60" w:semiHidden="0" w:name="Light Shading Accent 4"/>
-    <w:lsdException w:qFormat="1" w:unhideWhenUsed="0" w:uiPriority="61" w:semiHidden="0" w:name="Light List Accent 4"/>
-    <w:lsdException w:qFormat="1" w:unhideWhenUsed="0" w:uiPriority="62" w:semiHidden="0" w:name="Light Grid Accent 4"/>
-    <w:lsdException w:unhideWhenUsed="0" w:uiPriority="63" w:semiHidden="0" w:name="Medium Shading 1 Accent 4"/>
-    <w:lsdException w:unhideWhenUsed="0" w:uiPriority="64" w:semiHidden="0" w:name="Medium Shading 2 Accent 4"/>
-    <w:lsdException w:unhideWhenUsed="0" w:uiPriority="65" w:semiHidden="0" w:name="Medium List 1 Accent 4"/>
-    <w:lsdException w:unhideWhenUsed="0" w:uiPriority="66" w:semiHidden="0" w:name="Medium List 2 Accent 4"/>
-    <w:lsdException w:unhideWhenUsed="0" w:uiPriority="67" w:semiHidden="0" w:name="Medium Grid 1 Accent 4"/>
-    <w:lsdException w:unhideWhenUsed="0" w:uiPriority="68" w:semiHidden="0" w:name="Medium Grid 2 Accent 4"/>
-    <w:lsdException w:unhideWhenUsed="0" w:uiPriority="69" w:semiHidden="0" w:name="Medium Grid 3 Accent 4"/>
-    <w:lsdException w:unhideWhenUsed="0" w:uiPriority="70" w:semiHidden="0" w:name="Dark List Accent 4"/>
-    <w:lsdException w:unhideWhenUsed="0" w:uiPriority="71" w:semiHidden="0" w:name="Colorful Shading Accent 4"/>
-    <w:lsdException w:unhideWhenUsed="0" w:uiPriority="72" w:semiHidden="0" w:name="Colorful List Accent 4"/>
-    <w:lsdException w:unhideWhenUsed="0" w:uiPriority="73" w:semiHidden="0" w:name="Colorful Grid Accent 4"/>
-    <w:lsdException w:qFormat="1" w:unhideWhenUsed="0" w:uiPriority="60" w:semiHidden="0" w:name="Light Shading Accent 5"/>
-    <w:lsdException w:qFormat="1" w:unhideWhenUsed="0" w:uiPriority="61" w:semiHidden="0" w:name="Light List Accent 5"/>
-    <w:lsdException w:qFormat="1" w:unhideWhenUsed="0" w:uiPriority="62" w:semiHidden="0" w:name="Light Grid Accent 5"/>
-    <w:lsdException w:unhideWhenUsed="0" w:uiPriority="63" w:semiHidden="0" w:name="Medium Shading 1 Accent 5"/>
-    <w:lsdException w:unhideWhenUsed="0" w:uiPriority="64" w:semiHidden="0" w:name="Medium Shading 2 Accent 5"/>
-    <w:lsdException w:unhideWhenUsed="0" w:uiPriority="65" w:semiHidden="0" w:name="Medium List 1 Accent 5"/>
-    <w:lsdException w:unhideWhenUsed="0" w:uiPriority="66" w:semiHidden="0" w:name="Medium List 2 Accent 5"/>
-    <w:lsdException w:unhideWhenUsed="0" w:uiPriority="67" w:semiHidden="0" w:name="Medium Grid 1 Accent 5"/>
-    <w:lsdException w:unhideWhenUsed="0" w:uiPriority="68" w:semiHidden="0" w:name="Medium Grid 2 Accent 5"/>
-    <w:lsdException w:unhideWhenUsed="0" w:uiPriority="69" w:semiHidden="0" w:name="Medium Grid 3 Accent 5"/>
-    <w:lsdException w:unhideWhenUsed="0" w:uiPriority="70" w:semiHidden="0" w:name="Dark List Accent 5"/>
-    <w:lsdException w:unhideWhenUsed="0" w:uiPriority="71" w:semiHidden="0" w:name="Colorful Shading Accent 5"/>
-    <w:lsdException w:unhideWhenUsed="0" w:uiPriority="72" w:semiHidden="0" w:name="Colorful List Accent 5"/>
-    <w:lsdException w:unhideWhenUsed="0" w:uiPriority="73" w:semiHidden="0" w:name="Colorful Grid Accent 5"/>
-    <w:lsdException w:qFormat="1" w:unhideWhenUsed="0" w:uiPriority="60" w:semiHidden="0" w:name="Light Shading Accent 6"/>
-    <w:lsdException w:qFormat="1" w:unhideWhenUsed="0" w:uiPriority="61" w:semiHidden="0" w:name="Light List Accent 6"/>
-    <w:lsdException w:qFormat="1" w:unhideWhenUsed="0" w:uiPriority="62" w:semiHidden="0" w:name="Light Grid Accent 6"/>
-    <w:lsdException w:unhideWhenUsed="0" w:uiPriority="63" w:semiHidden="0" w:name="Medium Shading 1 Accent 6"/>
-    <w:lsdException w:unhideWhenUsed="0" w:uiPriority="64" w:semiHidden="0" w:name="Medium Shading 2 Accent 6"/>
-    <w:lsdException w:unhideWhenUsed="0" w:uiPriority="65" w:semiHidden="0" w:name="Medium List 1 Accent 6"/>
-    <w:lsdException w:unhideWhenUsed="0" w:uiPriority="66" w:semiHidden="0" w:name="Medium List 2 Accent 6"/>
-    <w:lsdException w:unhideWhenUsed="0" w:uiPriority="67" w:semiHidden="0" w:name="Medium Grid 1 Accent 6"/>
-    <w:lsdException w:unhideWhenUsed="0" w:uiPriority="68" w:semiHidden="0" w:name="Medium Grid 2 Accent 6"/>
-    <w:lsdException w:unhideWhenUsed="0" w:uiPriority="69" w:semiHidden="0" w:name="Medium Grid 3 Accent 6"/>
-    <w:lsdException w:unhideWhenUsed="0" w:uiPriority="70" w:semiHidden="0" w:name="Dark List Accent 6"/>
-    <w:lsdException w:unhideWhenUsed="0" w:uiPriority="71" w:semiHidden="0" w:name="Colorful Shading Accent 6"/>
-    <w:lsdException w:unhideWhenUsed="0" w:uiPriority="72" w:semiHidden="0" w:name="Colorful List Accent 6"/>
-    <w:lsdException w:unhideWhenUsed="0" w:uiPriority="73" w:semiHidden="0" w:name="Colorful Grid Accent 6"/>
   </w:latentStyles>
   <w:style w:type="paragraph" w:default="1" w:styleId="1">
     <w:name w:val="Normal"/>
@@ -5991,7 +5875,54 @@
       </w:tblCellMar>
     </w:tblPr>
   </w:style>
-  <w:style w:type="paragraph" w:styleId="4">
+  <w:style w:type="character" w:styleId="4">
+    <w:name w:val="FollowedHyperlink"/>
+    <w:basedOn w:val="2"/>
+    <w:semiHidden/>
+    <w:unhideWhenUsed/>
+    <w:qFormat/>
+    <w:uiPriority w:val="99"/>
+    <w:rPr>
+      <w:color w:val="800080"/>
+      <w:u w:val="single"/>
+    </w:rPr>
+  </w:style>
+  <w:style w:type="character" w:styleId="5">
+    <w:name w:val="Hyperlink"/>
+    <w:basedOn w:val="2"/>
+    <w:semiHidden/>
+    <w:unhideWhenUsed/>
+    <w:qFormat/>
+    <w:uiPriority w:val="99"/>
+    <w:rPr>
+      <w:color w:val="0000FF"/>
+      <w:u w:val="single"/>
+    </w:rPr>
+  </w:style>
+  <w:style w:type="character" w:styleId="6">
+    <w:name w:val="HTML Code"/>
+    <w:basedOn w:val="2"/>
+    <w:semiHidden/>
+    <w:unhideWhenUsed/>
+    <w:qFormat/>
+    <w:uiPriority w:val="99"/>
+    <w:rPr>
+      <w:rFonts w:ascii="Courier New" w:hAnsi="Courier New" w:cs="Courier New"/>
+      <w:sz w:val="20"/>
+      <w:szCs w:val="20"/>
+    </w:rPr>
+  </w:style>
+  <w:style w:type="character" w:styleId="7">
+    <w:name w:val="Strong"/>
+    <w:basedOn w:val="2"/>
+    <w:qFormat/>
+    <w:uiPriority w:val="22"/>
+    <w:rPr>
+      <w:b/>
+      <w:bCs/>
+    </w:rPr>
+  </w:style>
+  <w:style w:type="paragraph" w:styleId="8">
     <w:name w:val="Balloon Text"/>
     <w:basedOn w:val="1"/>
     <w:link w:val="16"/>
@@ -6008,19 +5939,22 @@
       <w:szCs w:val="16"/>
     </w:rPr>
   </w:style>
-  <w:style w:type="character" w:styleId="5">
-    <w:name w:val="FollowedHyperlink"/>
-    <w:basedOn w:val="2"/>
-    <w:semiHidden/>
+  <w:style w:type="paragraph" w:styleId="9">
+    <w:name w:val="header"/>
+    <w:basedOn w:val="1"/>
+    <w:link w:val="14"/>
     <w:unhideWhenUsed/>
     <w:qFormat/>
     <w:uiPriority w:val="99"/>
-    <w:rPr>
-      <w:color w:val="800080"/>
-      <w:u w:val="single"/>
-    </w:rPr>
+    <w:pPr>
+      <w:tabs>
+        <w:tab w:val="center" w:pos="4677"/>
+        <w:tab w:val="right" w:pos="9355"/>
+      </w:tabs>
+      <w:spacing w:after="0" w:line="240" w:lineRule="auto"/>
+    </w:pPr>
   </w:style>
-  <w:style w:type="paragraph" w:styleId="6">
+  <w:style w:type="paragraph" w:styleId="10">
     <w:name w:val="footer"/>
     <w:basedOn w:val="1"/>
     <w:link w:val="15"/>
@@ -6035,35 +5969,26 @@
       <w:spacing w:after="0" w:line="240" w:lineRule="auto"/>
     </w:pPr>
   </w:style>
-  <w:style w:type="paragraph" w:styleId="7">
-    <w:name w:val="header"/>
-    <w:basedOn w:val="1"/>
-    <w:link w:val="14"/>
+  <w:style w:type="paragraph" w:styleId="11">
+    <w:name w:val="Normal (Web)"/>
+    <w:semiHidden/>
     <w:unhideWhenUsed/>
     <w:qFormat/>
     <w:uiPriority w:val="99"/>
     <w:pPr>
-      <w:tabs>
-        <w:tab w:val="center" w:pos="4677"/>
-        <w:tab w:val="right" w:pos="9355"/>
-      </w:tabs>
-      <w:spacing w:after="0" w:line="240" w:lineRule="auto"/>
+      <w:spacing w:before="0" w:beforeAutospacing="1" w:after="0" w:afterAutospacing="1"/>
+      <w:ind w:left="0" w:right="0"/>
+      <w:jc w:val="left"/>
     </w:pPr>
-  </w:style>
-  <w:style w:type="character" w:styleId="8">
-    <w:name w:val="HTML Code"/>
-    <w:basedOn w:val="2"/>
-    <w:semiHidden/>
-    <w:unhideWhenUsed/>
-    <w:qFormat/>
-    <w:uiPriority w:val="99"/>
     <w:rPr>
-      <w:rFonts w:ascii="Courier New" w:hAnsi="Courier New" w:cs="Courier New"/>
-      <w:sz w:val="20"/>
-      <w:szCs w:val="20"/>
+      <w:rFonts w:ascii="Times New Roman" w:hAnsi="Times New Roman" w:eastAsia="SimSun" w:cs="Times New Roman"/>
+      <w:kern w:val="0"/>
+      <w:sz w:val="24"/>
+      <w:szCs w:val="24"/>
+      <w:lang w:val="en-US" w:eastAsia="zh-CN" w:bidi="ar"/>
     </w:rPr>
   </w:style>
-  <w:style w:type="paragraph" w:styleId="9">
+  <w:style w:type="paragraph" w:styleId="12">
     <w:name w:val="HTML Preformatted"/>
     <w:semiHidden/>
     <w:unhideWhenUsed/>
@@ -6098,47 +6023,6 @@
       <w:lang w:val="en-US" w:eastAsia="zh-CN" w:bidi="ar"/>
     </w:rPr>
   </w:style>
-  <w:style w:type="character" w:styleId="10">
-    <w:name w:val="Hyperlink"/>
-    <w:basedOn w:val="2"/>
-    <w:semiHidden/>
-    <w:unhideWhenUsed/>
-    <w:qFormat/>
-    <w:uiPriority w:val="99"/>
-    <w:rPr>
-      <w:color w:val="0000FF"/>
-      <w:u w:val="single"/>
-    </w:rPr>
-  </w:style>
-  <w:style w:type="paragraph" w:styleId="11">
-    <w:name w:val="Normal (Web)"/>
-    <w:semiHidden/>
-    <w:unhideWhenUsed/>
-    <w:qFormat/>
-    <w:uiPriority w:val="99"/>
-    <w:pPr>
-      <w:spacing w:before="0" w:beforeAutospacing="1" w:after="0" w:afterAutospacing="1"/>
-      <w:ind w:left="0" w:right="0"/>
-      <w:jc w:val="left"/>
-    </w:pPr>
-    <w:rPr>
-      <w:rFonts w:ascii="Times New Roman" w:hAnsi="Times New Roman" w:eastAsia="SimSun" w:cs="Times New Roman"/>
-      <w:kern w:val="0"/>
-      <w:sz w:val="24"/>
-      <w:szCs w:val="24"/>
-      <w:lang w:val="en-US" w:eastAsia="zh-CN" w:bidi="ar"/>
-    </w:rPr>
-  </w:style>
-  <w:style w:type="character" w:styleId="12">
-    <w:name w:val="Strong"/>
-    <w:basedOn w:val="2"/>
-    <w:qFormat/>
-    <w:uiPriority w:val="22"/>
-    <w:rPr>
-      <w:b/>
-      <w:bCs/>
-    </w:rPr>
-  </w:style>
   <w:style w:type="paragraph" w:styleId="13">
     <w:name w:val="List Paragraph"/>
     <w:basedOn w:val="1"/>
@@ -6152,21 +6036,21 @@
   <w:style w:type="character" w:customStyle="1" w:styleId="14">
     <w:name w:val="Верхний колонтитул Знак"/>
     <w:basedOn w:val="2"/>
-    <w:link w:val="7"/>
+    <w:link w:val="9"/>
     <w:qFormat/>
     <w:uiPriority w:val="99"/>
   </w:style>
   <w:style w:type="character" w:customStyle="1" w:styleId="15">
     <w:name w:val="Нижний колонтитул Знак"/>
     <w:basedOn w:val="2"/>
-    <w:link w:val="6"/>
+    <w:link w:val="10"/>
     <w:qFormat/>
     <w:uiPriority w:val="99"/>
   </w:style>
   <w:style w:type="character" w:customStyle="1" w:styleId="16">
     <w:name w:val="Текст выноски Знак"/>
     <w:basedOn w:val="2"/>
-    <w:link w:val="4"/>
+    <w:link w:val="8"/>
     <w:semiHidden/>
     <w:qFormat/>
     <w:uiPriority w:val="99"/>

</xml_diff>